<commit_message>
Update docs after successful Azure redeploy
Co-authored-by: Copilot <223556219+Copilot@users.noreply.github.com>
</commit_message>
<xml_diff>
--- a/DOCUMENTACION-COMPLETA-EFFICIENT-PARKING.docx
+++ b/DOCUMENTACION-COMPLETA-EFFICIENT-PARKING.docx
@@ -591,7 +591,7 @@
                 <w:color w:val="14243A"/>
                 <w:sz w:val="18"/>
               </w:rPr>
-              <w:t>Existe la URL efficient-parking-3126533e.azurewebsites.net; último despliegue HTTP 502 y /health HTTP 503.</w:t>
+              <w:t>URL efficient-parking-3126533e.azurewebsites.net; tras el redespliegue /health, /login y /student responden 200.</w:t>
             </w:r>
           </w:p>
         </w:tc>
@@ -612,7 +612,7 @@
                 <w:color w:val="14243A"/>
                 <w:sz w:val="18"/>
               </w:rPr>
-              <w:t>No declarar disponibilidad hasta restablecer y volver a probar.</w:t>
+              <w:t>Plan B1 con posible costo; sin alta disponibilidad.</w:t>
             </w:r>
           </w:p>
         </w:tc>
@@ -1440,7 +1440,7 @@
           <w:color w:val="24364B"/>
           <w:sz w:val="22"/>
         </w:rPr>
-        <w:t>Los requisitos se consideran cubiertos por código y pruebas locales cuando existe una ruta que implementa la conducta. La disponibilidad de un requisito en el sitio público depende además del estado del servicio, que en la última comprobación devolvió HTTP 503. Esta separación evita llamar funcional a un módulo que no se puede alcanzar en el entorno de despliegue.</w:t>
+        <w:t>Los requisitos se consideran cubiertos por código y pruebas locales cuando existe una ruta que implementa la conducta. La disponibilidad de un requisito en el sitio público depende además del estado del servicio, que el 23 de octubre de 2026 respondió correctamente tras un redespliegue (health, login de administración y dashboard). Se mantiene la distinción entre lo probado localmente, lo probado en Azure y lo no probado (APK en teléfono, asistente IA sin clave).</w:t>
       </w:r>
     </w:p>
     <w:tbl>
@@ -3564,7 +3564,7 @@
                 <w:color w:val="14243A"/>
                 <w:sz w:val="18"/>
               </w:rPr>
-              <w:t>No verificada en Azure: última respuesta HTTP 503</w:t>
+              <w:t>Verificada puntualmente en Azure (HTTP 200); sin SLA para producción</w:t>
             </w:r>
           </w:p>
         </w:tc>
@@ -9096,7 +9096,7 @@
                 <w:color w:val="14243A"/>
                 <w:sz w:val="18"/>
               </w:rPr>
-              <w:t>HTTP 503 en última comprobación</w:t>
+              <w:t>HTTP 200 tras el redespliegue</w:t>
             </w:r>
           </w:p>
         </w:tc>
@@ -9117,7 +9117,7 @@
                 <w:color w:val="14243A"/>
                 <w:sz w:val="18"/>
               </w:rPr>
-              <w:t>El servicio público requiere recuperación</w:t>
+              <w:t>Repetir antes de cada presentación</w:t>
             </w:r>
           </w:p>
         </w:tc>
@@ -10190,7 +10190,7 @@
           <w:color w:val="24364B"/>
           <w:sz w:val="22"/>
         </w:rPr>
-        <w:t>La instancia pública se llama `efficient-parking-3126533e`; su URL es https://efficient-parking-3126533e.azurewebsites.net. La región es México Central y el plan existente se cambió a B1 después de una cuota F1 agotada. En el último intento, Kudu devolvió HTTP 502 y `/health` respondió 503; revisar logs y facturación en Azure antes de nuevos intentos. El nombre del grupo `rg-efficient-parking-free-mx` es histórico y no prueba que el recurso no tenga costo.</w:t>
+        <w:t>La instancia pública se llama `efficient-parking-3126533e`; su URL es https://efficient-parking-3126533e.azurewebsites.net. La región es México Central y el plan existente se cambió a B1 después de una cuota F1 agotada. Un despliegue previo falló con Kudu 502 y arranques en frío con `Cannot find module 'dotenv'`; el redespliegue con el script del repositorio lo resolvió y `/health` responde 200. Revisar facturación en Azure. El nombre del grupo `rg-efficient-parking-free-mx` es histórico y no prueba que el recurso no tenga costo.</w:t>
       </w:r>
     </w:p>
     <w:p>
@@ -10818,7 +10818,7 @@
           <w:color w:val="24364B"/>
           <w:sz w:val="22"/>
         </w:rPr>
-        <w:t>La disponibilidad pública no está confirmada, la pantalla web de Azure tuvo una configuración anterior con localhost, y el despliegue de la corrección terminó en HTTP 502. El servicio de IA no está activo por ausencia de clave y recuperación de contraseña está deliberadamente deshabilitada. El plan B1 puede tener costo; su permanencia requiere revisar presupuesto.</w:t>
+        <w:t>La disponibilidad en Azure se comprobó de forma puntual y no está garantizada; hubo una configuración anterior con localhost y fallas de arranque ya corregidas, y el APK no se ha probado en teléfono. El servicio de IA no está activo por ausencia de clave y recuperación de contraseña está deliberadamente deshabilitada. El plan B1 puede tener costo; su permanencia requiere revisar presupuesto.</w:t>
       </w:r>
     </w:p>
     <w:p>
@@ -20302,7 +20302,7 @@
           <w:color w:val="24364B"/>
           <w:sz w:val="22"/>
         </w:rPr>
-        <w:t>Estado comprobado el 23 de octubre de 2026: existe el App Service efficient-parking-3126533e en Azure, pero el último despliegue terminó con HTTP 502 en Kudu y /health devolvió HTTP 503. La URL no debe presentarse como disponible hasta recuperar el servicio y repetir las pruebas. El plan actual se cambió a B1 y puede generar cargos. El APK existe como release, pero no se ha probado en un teléfono físico. El asistente IA requiere AI_API_KEY.</w:t>
+        <w:t>Estado comprobado el 23 de octubre de 2026 tras redesplegar: el App Service efficient-parking-3126533e en Azure responde 200 en /health, / , /login y /student; la web ya no apunta a localhost; el login de administración devuelve token y /api/dashboard/overview responde 200. Una falla previa (Cannot find module 'dotenv' en arranques en frío) se resolvió al redesplegar. El plan es B1 y puede generar cargos. El APK existe como release, pero no se ha probado en un teléfono físico. El asistente IA responde 503 con sesión mientras no se configure AI_API_KEY.</w:t>
       </w:r>
     </w:p>
     <w:p>
@@ -20545,7 +20545,7 @@
                 <w:color w:val="14243A"/>
                 <w:sz w:val="18"/>
               </w:rPr>
-              <w:t>La arquitectura existe; el servicio de Azure no respondió en la última comprobación</w:t>
+              <w:t>Implementado y desplegado en Azure; /health responde 200 tras el redespliegue</w:t>
             </w:r>
           </w:p>
         </w:tc>
@@ -20743,7 +20743,7 @@
                 <w:color w:val="14243A"/>
                 <w:sz w:val="18"/>
               </w:rPr>
-              <w:t>Estado comprobado el 23 de octubre de 2026: existe el App Service efficient-parking-3126533e en Azure, pero el último despliegue terminó con HTTP 502 en Kudu y /health devolvió HTTP 503. La URL no debe presentarse como disponible hasta recuperar el servicio y repetir las pruebas. El plan actual se cambió a B1 y puede generar cargos. El APK existe como release, pero no se ha probado en un teléfono físico. El asistente IA requiere AI_API_KEY.</w:t>
+              <w:t>Estado comprobado el 23 de octubre de 2026 tras redesplegar: el App Service efficient-parking-3126533e en Azure responde 200 en /health, / , /login y /student; la web ya no apunta a localhost; el login de administración devuelve token y /api/dashboard/overview responde 200. Una falla previa (Cannot find module 'dotenv' en arranques en frío) se resolvió al redesplegar. El plan es B1 y puede generar cargos. El APK existe como release, pero no se ha probado en un teléfono físico. El asistente IA responde 503 con sesión mientras no se configure AI_API_KEY.</w:t>
             </w:r>
           </w:p>
         </w:tc>
@@ -20811,7 +20811,7 @@
                 <w:color w:val="14243A"/>
                 <w:sz w:val="18"/>
               </w:rPr>
-              <w:t>URL y APK publicados; la disponibilidad de Azure y la instalación en teléfono no están verificadas</w:t>
+              <w:t>URL y APK publicados; la instalación del APK en teléfono no está verificada</w:t>
             </w:r>
           </w:p>
         </w:tc>
@@ -27643,7 +27643,7 @@
           <w:color w:val="24364B"/>
           <w:sz w:val="22"/>
         </w:rPr>
-        <w:t>Estado comprobado el 23 de octubre de 2026: existe el App Service efficient-parking-3126533e en Azure, pero el último despliegue terminó con HTTP 502 en Kudu y /health devolvió HTTP 503. La URL no debe presentarse como disponible hasta recuperar el servicio y repetir las pruebas. El plan actual se cambió a B1 y puede generar cargos. El APK existe como release, pero no se ha probado en un teléfono físico. El asistente IA requiere AI_API_KEY.</w:t>
+        <w:t>Estado comprobado el 23 de octubre de 2026 tras redesplegar: el App Service efficient-parking-3126533e en Azure responde 200 en /health, / , /login y /student; la web ya no apunta a localhost; el login de administración devuelve token y /api/dashboard/overview responde 200. Una falla previa (Cannot find module 'dotenv' en arranques en frío) se resolvió al redesplegar. El plan es B1 y puede generar cargos. El APK existe como release, pero no se ha probado en un teléfono físico. El asistente IA responde 503 con sesión mientras no se configure AI_API_KEY.</w:t>
       </w:r>
     </w:p>
     <w:p>
@@ -27753,6 +27753,11 @@
       </w:r>
     </w:p>
     <w:p>
+      <w:r>
+        <w:br w:type="page"/>
+      </w:r>
+    </w:p>
+    <w:p>
       <w:pPr>
         <w:widowControl/>
         <w:spacing w:line="324" w:lineRule="auto" w:after="120"/>
@@ -27769,11 +27774,6 @@
       </w:r>
     </w:p>
     <w:p>
-      <w:r>
-        <w:br w:type="page"/>
-      </w:r>
-    </w:p>
-    <w:p>
       <w:pPr>
         <w:widowControl/>
         <w:spacing w:line="324" w:lineRule="auto" w:after="120"/>
@@ -27980,6 +27980,11 @@
       </w:r>
     </w:p>
     <w:p>
+      <w:r>
+        <w:br w:type="page"/>
+      </w:r>
+    </w:p>
+    <w:p>
       <w:pPr>
         <w:widowControl/>
         <w:spacing w:line="324" w:lineRule="auto" w:after="120"/>
@@ -27996,11 +28001,6 @@
       </w:r>
     </w:p>
     <w:p>
-      <w:r>
-        <w:br w:type="page"/>
-      </w:r>
-    </w:p>
-    <w:p>
       <w:pPr>
         <w:widowControl/>
         <w:spacing w:line="324" w:lineRule="auto" w:after="120"/>
@@ -28097,6 +28097,11 @@
       </w:r>
     </w:p>
     <w:p>
+      <w:r>
+        <w:br w:type="page"/>
+      </w:r>
+    </w:p>
+    <w:p>
       <w:pPr>
         <w:widowControl/>
         <w:spacing w:line="324" w:lineRule="auto" w:after="120"/>
@@ -28129,11 +28134,6 @@
       </w:r>
     </w:p>
     <w:p>
-      <w:r>
-        <w:br w:type="page"/>
-      </w:r>
-    </w:p>
-    <w:p>
       <w:pPr>
         <w:widowControl/>
         <w:spacing w:line="324" w:lineRule="auto" w:after="120"/>
@@ -28218,6 +28218,11 @@
       </w:r>
     </w:p>
     <w:p>
+      <w:r>
+        <w:br w:type="page"/>
+      </w:r>
+    </w:p>
+    <w:p>
       <w:pPr>
         <w:widowControl/>
         <w:spacing w:line="324" w:lineRule="auto" w:after="120"/>
@@ -28234,11 +28239,6 @@
       </w:r>
     </w:p>
     <w:p>
-      <w:r>
-        <w:br w:type="page"/>
-      </w:r>
-    </w:p>
-    <w:p>
       <w:pPr>
         <w:widowControl/>
         <w:spacing w:line="324" w:lineRule="auto" w:after="120"/>
@@ -28303,6 +28303,11 @@
       </w:r>
     </w:p>
     <w:p>
+      <w:r>
+        <w:br w:type="page"/>
+      </w:r>
+    </w:p>
+    <w:p>
       <w:pPr>
         <w:widowControl/>
         <w:spacing w:line="324" w:lineRule="auto" w:after="120"/>
@@ -28331,12 +28336,7 @@
           <w:color w:val="24364B"/>
           <w:sz w:val="22"/>
         </w:rPr>
-        <w:t>Azure devolvió HTTP 502 en el último despliegue y HTTP 503 en /health. Revisar Kudu y costos antes de repetir; no declarar disponibilidad hasta que pasen las pruebas públicas.</w:t>
-      </w:r>
-    </w:p>
-    <w:p>
-      <w:r>
-        <w:br w:type="page"/>
+        <w:t>Azure respondió 200 tras redesplegar. El plan B1 puede generar costo; revisar Cost Management y repetir las pruebas de salud antes de presentar.</w:t>
       </w:r>
     </w:p>
     <w:p>
@@ -29713,7 +29713,7 @@
           <w:color w:val="24364B"/>
           <w:sz w:val="22"/>
         </w:rPr>
-        <w:t>Estado comprobado el 23 de octubre de 2026: existe el App Service efficient-parking-3126533e en Azure, pero el último despliegue terminó con HTTP 502 en Kudu y /health devolvió HTTP 503. La URL no debe presentarse como disponible hasta recuperar el servicio y repetir las pruebas. El plan actual se cambió a B1 y puede generar cargos. El APK existe como release, pero no se ha probado en un teléfono físico. El asistente IA requiere AI_API_KEY.</w:t>
+        <w:t>Estado comprobado el 23 de octubre de 2026 tras redesplegar: el App Service efficient-parking-3126533e en Azure responde 200 en /health, / , /login y /student; la web ya no apunta a localhost; el login de administración devuelve token y /api/dashboard/overview responde 200. Una falla previa (Cannot find module 'dotenv' en arranques en frío) se resolvió al redesplegar. El plan es B1 y puede generar cargos. El APK existe como release, pero no se ha probado en un teléfono físico. El asistente IA responde 503 con sesión mientras no se configure AI_API_KEY.</w:t>
       </w:r>
     </w:p>
     <w:p>
@@ -29746,6 +29746,11 @@
           <w:sz w:val="22"/>
         </w:rPr>
         <w:t>¿Qué significa dashboard en vivo aquí? El cliente pide datos agregados al backend cada cinco segundos. Es actualización periódica (polling), no transmisión instantánea por WebSocket; las métricas solo reflejan lo que registra SQLite.</w:t>
+      </w:r>
+    </w:p>
+    <w:p>
+      <w:r>
+        <w:br w:type="page"/>
       </w:r>
     </w:p>
     <w:p>
@@ -31302,7 +31307,7 @@
           <w:color w:val="24364B"/>
           <w:sz w:val="22"/>
         </w:rPr>
-        <w:t>Estado comprobado el 23 de octubre de 2026: existe el App Service efficient-parking-3126533e en Azure, pero el último despliegue terminó con HTTP 502 en Kudu y /health devolvió HTTP 503. La URL no debe presentarse como disponible hasta recuperar el servicio y repetir las pruebas. El plan actual se cambió a B1 y puede generar cargos. El APK existe como release, pero no se ha probado en un teléfono físico. El asistente IA requiere AI_API_KEY.</w:t>
+        <w:t>Estado comprobado el 23 de octubre de 2026 tras redesplegar: el App Service efficient-parking-3126533e en Azure responde 200 en /health, / , /login y /student; la web ya no apunta a localhost; el login de administración devuelve token y /api/dashboard/overview responde 200. Una falla previa (Cannot find module 'dotenv' en arranques en frío) se resolvió al redesplegar. El plan es B1 y puede generar cargos. El APK existe como release, pero no se ha probado en un teléfono físico. El asistente IA responde 503 con sesión mientras no se configure AI_API_KEY.</w:t>
       </w:r>
     </w:p>
     <w:p>
@@ -31354,6 +31359,11 @@
       </w:r>
     </w:p>
     <w:p>
+      <w:r>
+        <w:br w:type="page"/>
+      </w:r>
+    </w:p>
+    <w:p>
       <w:pPr>
         <w:widowControl/>
         <w:spacing w:line="324" w:lineRule="auto" w:after="120"/>
@@ -31409,11 +31419,6 @@
           <w:sz w:val="22"/>
         </w:rPr>
         <w:t>npm run api</w:t>
-      </w:r>
-    </w:p>
-    <w:p>
-      <w:r>
-        <w:br w:type="page"/>
       </w:r>
     </w:p>
     <w:p>
@@ -32029,7 +32034,7 @@
                 <w:color w:val="14243A"/>
                 <w:sz w:val="18"/>
               </w:rPr>
-              <w:t>Que el servicio responda: último health 503</w:t>
+              <w:t>Que el servicio respondió 200 el 23/10/2026; sin garantía continua</w:t>
             </w:r>
           </w:p>
         </w:tc>

</xml_diff>